<commit_message>
Thầy an cho up lại
Thầy an cho up lại
</commit_message>
<xml_diff>
--- a/btth_ss3.docx
+++ b/btth_ss3.docx
@@ -4,1000 +4,1801 @@
   <w:body>
     <w:p>
       <w:pPr>
-        <w:pStyle w:val="Heading1"/>
         <w:rPr>
-          <w:color w:val="000000" w:themeColor="text1"/>
+          <w:b/>
+          <w:bCs/>
         </w:rPr>
       </w:pPr>
+      <w:proofErr w:type="spellStart"/>
       <w:r>
         <w:rPr>
-          <w:color w:val="000000" w:themeColor="text1"/>
+          <w:b/>
+          <w:bCs/>
         </w:rPr>
-        <w:t>PHẦN A. RÀ SOÁT BACKLOG HIỆN TẠI</w:t>
+        <w:t>Phần</w:t>
+      </w:r>
+      <w:proofErr w:type="spellEnd"/>
+      <w:r>
+        <w:rPr>
+          <w:b/>
+          <w:bCs/>
+        </w:rPr>
+        <w:t xml:space="preserve"> A:</w:t>
       </w:r>
     </w:p>
     <w:p>
-      <w:pPr>
-        <w:pStyle w:val="Heading2"/>
-        <w:rPr>
-          <w:color w:val="000000" w:themeColor="text1"/>
-        </w:rPr>
-      </w:pPr>
-      <w:r>
-        <w:rPr>
-          <w:color w:val="000000" w:themeColor="text1"/>
-        </w:rPr>
-        <w:t>1. Đánh giá S1 và S2</w:t>
+      <w:r>
+        <w:t xml:space="preserve">- </w:t>
+      </w:r>
+      <w:r>
+        <w:t xml:space="preserve">S1: </w:t>
+      </w:r>
+      <w:proofErr w:type="spellStart"/>
+      <w:r>
+        <w:t>Đúng</w:t>
+      </w:r>
+      <w:proofErr w:type="spellEnd"/>
+      <w:r>
+        <w:t xml:space="preserve">. </w:t>
+      </w:r>
+      <w:proofErr w:type="spellStart"/>
+      <w:r>
+        <w:t>Đúng</w:t>
+      </w:r>
+      <w:proofErr w:type="spellEnd"/>
+      <w:r>
+        <w:t xml:space="preserve"> </w:t>
+      </w:r>
+      <w:proofErr w:type="spellStart"/>
+      <w:r>
+        <w:t>cấu</w:t>
+      </w:r>
+      <w:proofErr w:type="spellEnd"/>
+      <w:r>
+        <w:t xml:space="preserve"> </w:t>
+      </w:r>
+      <w:proofErr w:type="spellStart"/>
+      <w:r>
+        <w:t>trúc</w:t>
+      </w:r>
+      <w:proofErr w:type="spellEnd"/>
+      <w:r>
+        <w:t xml:space="preserve"> User Story, </w:t>
+      </w:r>
+      <w:proofErr w:type="spellStart"/>
+      <w:r>
+        <w:t>có</w:t>
+      </w:r>
+      <w:proofErr w:type="spellEnd"/>
+      <w:r>
+        <w:t xml:space="preserve"> </w:t>
+      </w:r>
+      <w:proofErr w:type="spellStart"/>
+      <w:r>
+        <w:t>giá</w:t>
+      </w:r>
+      <w:proofErr w:type="spellEnd"/>
+      <w:r>
+        <w:t xml:space="preserve"> </w:t>
+      </w:r>
+      <w:proofErr w:type="spellStart"/>
+      <w:r>
+        <w:t>trị</w:t>
+      </w:r>
+      <w:proofErr w:type="spellEnd"/>
+      <w:r>
+        <w:t xml:space="preserve"> </w:t>
+      </w:r>
+      <w:proofErr w:type="spellStart"/>
+      <w:r>
+        <w:t>người</w:t>
+      </w:r>
+      <w:proofErr w:type="spellEnd"/>
+      <w:r>
+        <w:t xml:space="preserve"> </w:t>
+      </w:r>
+      <w:proofErr w:type="spellStart"/>
+      <w:r>
+        <w:t>dùng</w:t>
+      </w:r>
+      <w:proofErr w:type="spellEnd"/>
+      <w:r>
+        <w:t xml:space="preserve"> </w:t>
+      </w:r>
+      <w:proofErr w:type="spellStart"/>
+      <w:r>
+        <w:t>và</w:t>
+      </w:r>
+      <w:proofErr w:type="spellEnd"/>
+      <w:r>
+        <w:t xml:space="preserve"> </w:t>
+      </w:r>
+      <w:proofErr w:type="spellStart"/>
+      <w:r>
+        <w:t>đạt</w:t>
+      </w:r>
+      <w:proofErr w:type="spellEnd"/>
+      <w:r>
+        <w:t xml:space="preserve"> INVEST.</w:t>
       </w:r>
     </w:p>
     <w:p>
-      <w:pPr>
-        <w:pStyle w:val="Heading3"/>
-        <w:rPr>
-          <w:color w:val="000000" w:themeColor="text1"/>
-        </w:rPr>
-      </w:pPr>
-      <w:r>
-        <w:rPr>
-          <w:color w:val="000000" w:themeColor="text1"/>
-        </w:rPr>
-        <w:t>S1 – Hợp lệ</w:t>
+      <w:r>
+        <w:t xml:space="preserve">- </w:t>
+      </w:r>
+      <w:r>
+        <w:t xml:space="preserve">S2: Sai. Vi </w:t>
+      </w:r>
+      <w:proofErr w:type="spellStart"/>
+      <w:r>
+        <w:t>phạm</w:t>
+      </w:r>
+      <w:proofErr w:type="spellEnd"/>
+      <w:r>
+        <w:t xml:space="preserve"> </w:t>
+      </w:r>
+      <w:proofErr w:type="spellStart"/>
+      <w:r>
+        <w:t>nguyên</w:t>
+      </w:r>
+      <w:proofErr w:type="spellEnd"/>
+      <w:r>
+        <w:t xml:space="preserve"> </w:t>
+      </w:r>
+      <w:proofErr w:type="spellStart"/>
+      <w:r>
+        <w:t>tắc</w:t>
+      </w:r>
+      <w:proofErr w:type="spellEnd"/>
+      <w:r>
+        <w:t xml:space="preserve"> </w:t>
+      </w:r>
+      <w:proofErr w:type="spellStart"/>
+      <w:r>
+        <w:t>phân</w:t>
+      </w:r>
+      <w:proofErr w:type="spellEnd"/>
+      <w:r>
+        <w:t xml:space="preserve"> </w:t>
+      </w:r>
+      <w:proofErr w:type="spellStart"/>
+      <w:r>
+        <w:t>cấp</w:t>
+      </w:r>
+      <w:proofErr w:type="spellEnd"/>
+      <w:r>
+        <w:t xml:space="preserve">: </w:t>
+      </w:r>
+      <w:proofErr w:type="spellStart"/>
+      <w:r>
+        <w:t>gộp</w:t>
+      </w:r>
+      <w:proofErr w:type="spellEnd"/>
+      <w:r>
+        <w:t xml:space="preserve"> </w:t>
+      </w:r>
+      <w:proofErr w:type="spellStart"/>
+      <w:r>
+        <w:t>nhiều</w:t>
+      </w:r>
+      <w:proofErr w:type="spellEnd"/>
+      <w:r>
+        <w:t xml:space="preserve"> </w:t>
+      </w:r>
+      <w:proofErr w:type="spellStart"/>
+      <w:r>
+        <w:t>chức</w:t>
+      </w:r>
+      <w:proofErr w:type="spellEnd"/>
+      <w:r>
+        <w:t xml:space="preserve"> </w:t>
+      </w:r>
+      <w:proofErr w:type="spellStart"/>
+      <w:r>
+        <w:t>năng</w:t>
+      </w:r>
+      <w:proofErr w:type="spellEnd"/>
+      <w:r>
+        <w:t xml:space="preserve"> </w:t>
+      </w:r>
+      <w:proofErr w:type="spellStart"/>
+      <w:r>
+        <w:t>của</w:t>
+      </w:r>
+      <w:proofErr w:type="spellEnd"/>
+      <w:r>
+        <w:t xml:space="preserve"> Feature </w:t>
+      </w:r>
+      <w:proofErr w:type="spellStart"/>
+      <w:r>
+        <w:t>vào</w:t>
+      </w:r>
+      <w:proofErr w:type="spellEnd"/>
+      <w:r>
+        <w:t xml:space="preserve"> </w:t>
+      </w:r>
+      <w:proofErr w:type="spellStart"/>
+      <w:r>
+        <w:t>một</w:t>
+      </w:r>
+      <w:proofErr w:type="spellEnd"/>
+      <w:r>
+        <w:t xml:space="preserve"> User Story. Story </w:t>
+      </w:r>
+      <w:proofErr w:type="spellStart"/>
+      <w:r>
+        <w:t>quá</w:t>
+      </w:r>
+      <w:proofErr w:type="spellEnd"/>
+      <w:r>
+        <w:t xml:space="preserve"> </w:t>
+      </w:r>
+      <w:proofErr w:type="spellStart"/>
+      <w:r>
+        <w:t>lớn</w:t>
+      </w:r>
+      <w:proofErr w:type="spellEnd"/>
+      <w:r>
+        <w:t xml:space="preserve">, </w:t>
+      </w:r>
+      <w:proofErr w:type="spellStart"/>
+      <w:r>
+        <w:t>không</w:t>
+      </w:r>
+      <w:proofErr w:type="spellEnd"/>
+      <w:r>
+        <w:t xml:space="preserve"> </w:t>
+      </w:r>
+      <w:proofErr w:type="spellStart"/>
+      <w:r>
+        <w:t>độc</w:t>
+      </w:r>
+      <w:proofErr w:type="spellEnd"/>
+      <w:r>
+        <w:t xml:space="preserve"> </w:t>
+      </w:r>
+      <w:proofErr w:type="spellStart"/>
+      <w:r>
+        <w:t>lập</w:t>
+      </w:r>
+      <w:proofErr w:type="spellEnd"/>
+      <w:r>
+        <w:t xml:space="preserve"> </w:t>
+      </w:r>
+      <w:proofErr w:type="spellStart"/>
+      <w:r>
+        <w:t>rõ</w:t>
+      </w:r>
+      <w:proofErr w:type="spellEnd"/>
+      <w:r>
+        <w:t xml:space="preserve"> </w:t>
+      </w:r>
+      <w:proofErr w:type="spellStart"/>
+      <w:r>
+        <w:t>ràng</w:t>
+      </w:r>
+      <w:proofErr w:type="spellEnd"/>
+      <w:r>
+        <w:t xml:space="preserve"> </w:t>
+      </w:r>
+      <w:proofErr w:type="spellStart"/>
+      <w:r>
+        <w:t>và</w:t>
+      </w:r>
+      <w:proofErr w:type="spellEnd"/>
+      <w:r>
+        <w:t xml:space="preserve"> </w:t>
+      </w:r>
+      <w:proofErr w:type="spellStart"/>
+      <w:r>
+        <w:t>khó</w:t>
+      </w:r>
+      <w:proofErr w:type="spellEnd"/>
+      <w:r>
+        <w:t xml:space="preserve"> </w:t>
+      </w:r>
+      <w:proofErr w:type="spellStart"/>
+      <w:r>
+        <w:t>ước</w:t>
+      </w:r>
+      <w:proofErr w:type="spellEnd"/>
+      <w:r>
+        <w:t xml:space="preserve"> </w:t>
+      </w:r>
+      <w:proofErr w:type="spellStart"/>
+      <w:r>
+        <w:t>lượng</w:t>
+      </w:r>
+      <w:proofErr w:type="spellEnd"/>
+      <w:r>
+        <w:t xml:space="preserve"> (Small).</w:t>
+      </w:r>
+    </w:p>
+    <w:p>
+      <w:r>
+        <w:t xml:space="preserve">- </w:t>
+      </w:r>
+      <w:r>
+        <w:t xml:space="preserve">S2 </w:t>
+      </w:r>
+      <w:proofErr w:type="spellStart"/>
+      <w:r>
+        <w:t>không</w:t>
+      </w:r>
+      <w:proofErr w:type="spellEnd"/>
+      <w:r>
+        <w:t xml:space="preserve"> </w:t>
+      </w:r>
+      <w:proofErr w:type="spellStart"/>
+      <w:r>
+        <w:t>thể</w:t>
+      </w:r>
+      <w:proofErr w:type="spellEnd"/>
+      <w:r>
+        <w:t xml:space="preserve"> </w:t>
+      </w:r>
+      <w:proofErr w:type="spellStart"/>
+      <w:r>
+        <w:t>đưa</w:t>
+      </w:r>
+      <w:proofErr w:type="spellEnd"/>
+      <w:r>
+        <w:t xml:space="preserve"> </w:t>
+      </w:r>
+      <w:proofErr w:type="spellStart"/>
+      <w:r>
+        <w:t>thẳng</w:t>
+      </w:r>
+      <w:proofErr w:type="spellEnd"/>
+      <w:r>
+        <w:t xml:space="preserve"> </w:t>
+      </w:r>
+      <w:proofErr w:type="spellStart"/>
+      <w:r>
+        <w:t>vào</w:t>
+      </w:r>
+      <w:proofErr w:type="spellEnd"/>
+      <w:r>
+        <w:t xml:space="preserve"> Sprint </w:t>
+      </w:r>
+      <w:proofErr w:type="spellStart"/>
+      <w:r>
+        <w:t>vì</w:t>
+      </w:r>
+      <w:proofErr w:type="spellEnd"/>
+      <w:r>
+        <w:t xml:space="preserve"> </w:t>
+      </w:r>
+      <w:proofErr w:type="spellStart"/>
+      <w:r>
+        <w:t>chứa</w:t>
+      </w:r>
+      <w:proofErr w:type="spellEnd"/>
+      <w:r>
+        <w:t xml:space="preserve"> </w:t>
+      </w:r>
+      <w:proofErr w:type="spellStart"/>
+      <w:r>
+        <w:t>nhiều</w:t>
+      </w:r>
+      <w:proofErr w:type="spellEnd"/>
+      <w:r>
+        <w:t xml:space="preserve"> </w:t>
+      </w:r>
+      <w:proofErr w:type="spellStart"/>
+      <w:r>
+        <w:t>công</w:t>
+      </w:r>
+      <w:proofErr w:type="spellEnd"/>
+      <w:r>
+        <w:t xml:space="preserve"> </w:t>
+      </w:r>
+      <w:proofErr w:type="spellStart"/>
+      <w:r>
+        <w:t>việc</w:t>
+      </w:r>
+      <w:proofErr w:type="spellEnd"/>
+      <w:r>
+        <w:t xml:space="preserve">: </w:t>
+      </w:r>
+      <w:proofErr w:type="spellStart"/>
+      <w:r>
+        <w:t>chấm</w:t>
+      </w:r>
+      <w:proofErr w:type="spellEnd"/>
+      <w:r>
+        <w:t xml:space="preserve"> </w:t>
+      </w:r>
+      <w:proofErr w:type="spellStart"/>
+      <w:r>
+        <w:t>sao</w:t>
+      </w:r>
+      <w:proofErr w:type="spellEnd"/>
+      <w:r>
+        <w:t xml:space="preserve">, </w:t>
+      </w:r>
+      <w:proofErr w:type="spellStart"/>
+      <w:r>
+        <w:t>viết</w:t>
+      </w:r>
+      <w:proofErr w:type="spellEnd"/>
+      <w:r>
+        <w:t xml:space="preserve"> </w:t>
+      </w:r>
+      <w:proofErr w:type="spellStart"/>
+      <w:r>
+        <w:t>bình</w:t>
+      </w:r>
+      <w:proofErr w:type="spellEnd"/>
+      <w:r>
+        <w:t xml:space="preserve"> </w:t>
+      </w:r>
+      <w:proofErr w:type="spellStart"/>
+      <w:r>
+        <w:t>luận</w:t>
+      </w:r>
+      <w:proofErr w:type="spellEnd"/>
+      <w:r>
+        <w:t xml:space="preserve">, </w:t>
+      </w:r>
+      <w:proofErr w:type="spellStart"/>
+      <w:r>
+        <w:t>đính</w:t>
+      </w:r>
+      <w:proofErr w:type="spellEnd"/>
+      <w:r>
+        <w:t xml:space="preserve"> </w:t>
+      </w:r>
+      <w:proofErr w:type="spellStart"/>
+      <w:r>
+        <w:t>kèm</w:t>
+      </w:r>
+      <w:proofErr w:type="spellEnd"/>
+      <w:r>
+        <w:t xml:space="preserve"> </w:t>
+      </w:r>
+      <w:proofErr w:type="spellStart"/>
+      <w:r>
+        <w:t>ảnh</w:t>
+      </w:r>
+      <w:proofErr w:type="spellEnd"/>
+      <w:r>
+        <w:t xml:space="preserve">, </w:t>
+      </w:r>
+      <w:proofErr w:type="spellStart"/>
+      <w:r>
+        <w:t>gửi</w:t>
+      </w:r>
+      <w:proofErr w:type="spellEnd"/>
+      <w:r>
+        <w:t xml:space="preserve"> </w:t>
+      </w:r>
+      <w:proofErr w:type="spellStart"/>
+      <w:r>
+        <w:t>đánh</w:t>
+      </w:r>
+      <w:proofErr w:type="spellEnd"/>
+      <w:r>
+        <w:t xml:space="preserve"> </w:t>
+      </w:r>
+      <w:proofErr w:type="spellStart"/>
+      <w:r>
+        <w:t>giá</w:t>
+      </w:r>
+      <w:proofErr w:type="spellEnd"/>
+      <w:r>
+        <w:t xml:space="preserve">, </w:t>
+      </w:r>
+      <w:proofErr w:type="spellStart"/>
+      <w:r>
+        <w:t>kiểm</w:t>
+      </w:r>
+      <w:proofErr w:type="spellEnd"/>
+      <w:r>
+        <w:t xml:space="preserve"> </w:t>
+      </w:r>
+      <w:proofErr w:type="spellStart"/>
+      <w:r>
+        <w:t>duyệt</w:t>
+      </w:r>
+      <w:proofErr w:type="spellEnd"/>
+      <w:r>
+        <w:t xml:space="preserve"> </w:t>
+      </w:r>
+      <w:proofErr w:type="spellStart"/>
+      <w:r>
+        <w:t>và</w:t>
+      </w:r>
+      <w:proofErr w:type="spellEnd"/>
+      <w:r>
+        <w:t xml:space="preserve"> </w:t>
+      </w:r>
+      <w:proofErr w:type="spellStart"/>
+      <w:r>
+        <w:t>hiển</w:t>
+      </w:r>
+      <w:proofErr w:type="spellEnd"/>
+      <w:r>
+        <w:t xml:space="preserve"> </w:t>
+      </w:r>
+      <w:proofErr w:type="spellStart"/>
+      <w:r>
+        <w:t>thị</w:t>
+      </w:r>
+      <w:proofErr w:type="spellEnd"/>
+      <w:r>
+        <w:t xml:space="preserve">. </w:t>
+      </w:r>
+      <w:proofErr w:type="spellStart"/>
+      <w:r>
+        <w:t>Cần</w:t>
+      </w:r>
+      <w:proofErr w:type="spellEnd"/>
+      <w:r>
+        <w:t xml:space="preserve"> </w:t>
+      </w:r>
+      <w:proofErr w:type="spellStart"/>
+      <w:r>
+        <w:t>tách</w:t>
+      </w:r>
+      <w:proofErr w:type="spellEnd"/>
+      <w:r>
+        <w:t xml:space="preserve"> </w:t>
+      </w:r>
+      <w:proofErr w:type="spellStart"/>
+      <w:r>
+        <w:t>nhỏ</w:t>
+      </w:r>
+      <w:proofErr w:type="spellEnd"/>
+      <w:r>
+        <w:t xml:space="preserve"> </w:t>
+      </w:r>
+      <w:proofErr w:type="spellStart"/>
+      <w:r>
+        <w:t>để</w:t>
+      </w:r>
+      <w:proofErr w:type="spellEnd"/>
+      <w:r>
+        <w:t xml:space="preserve"> </w:t>
+      </w:r>
+      <w:proofErr w:type="spellStart"/>
+      <w:r>
+        <w:t>phát</w:t>
+      </w:r>
+      <w:proofErr w:type="spellEnd"/>
+      <w:r>
+        <w:t xml:space="preserve"> </w:t>
+      </w:r>
+      <w:proofErr w:type="spellStart"/>
+      <w:r>
+        <w:t>triển</w:t>
+      </w:r>
+      <w:proofErr w:type="spellEnd"/>
+      <w:r>
+        <w:t xml:space="preserve">, </w:t>
+      </w:r>
+      <w:proofErr w:type="spellStart"/>
+      <w:r>
+        <w:t>kiểm</w:t>
+      </w:r>
+      <w:proofErr w:type="spellEnd"/>
+      <w:r>
+        <w:t xml:space="preserve"> </w:t>
+      </w:r>
+      <w:proofErr w:type="spellStart"/>
+      <w:r>
+        <w:t>thử</w:t>
+      </w:r>
+      <w:proofErr w:type="spellEnd"/>
+      <w:r>
+        <w:t xml:space="preserve"> </w:t>
+      </w:r>
+      <w:proofErr w:type="spellStart"/>
+      <w:r>
+        <w:t>và</w:t>
+      </w:r>
+      <w:proofErr w:type="spellEnd"/>
+      <w:r>
+        <w:t xml:space="preserve"> </w:t>
+      </w:r>
+      <w:proofErr w:type="spellStart"/>
+      <w:r>
+        <w:t>ước</w:t>
+      </w:r>
+      <w:proofErr w:type="spellEnd"/>
+      <w:r>
+        <w:t xml:space="preserve"> </w:t>
+      </w:r>
+      <w:proofErr w:type="spellStart"/>
+      <w:r>
+        <w:t>lượng</w:t>
+      </w:r>
+      <w:proofErr w:type="spellEnd"/>
+      <w:r>
+        <w:t xml:space="preserve"> </w:t>
+      </w:r>
+      <w:proofErr w:type="spellStart"/>
+      <w:r>
+        <w:t>riêng</w:t>
+      </w:r>
+      <w:proofErr w:type="spellEnd"/>
+      <w:r>
+        <w:t>.</w:t>
       </w:r>
     </w:p>
     <w:p>
       <w:pPr>
         <w:rPr>
-          <w:color w:val="000000" w:themeColor="text1"/>
+          <w:b/>
+          <w:bCs/>
         </w:rPr>
       </w:pPr>
+      <w:proofErr w:type="spellStart"/>
       <w:r>
         <w:rPr>
-          <w:color w:val="000000" w:themeColor="text1"/>
+          <w:b/>
+          <w:bCs/>
         </w:rPr>
-        <w:t>“Là một khách hàng, tôi muốn chấm sao (1–5 sao) cho sản phẩm đã mua, để chia sẻ mức độ hài lòng của mình.”</w:t>
-      </w:r>
+        <w:t>Phần</w:t>
+      </w:r>
+      <w:proofErr w:type="spellEnd"/>
+      <w:r>
+        <w:rPr>
+          <w:b/>
+          <w:bCs/>
+        </w:rPr>
+        <w:t xml:space="preserve"> B:</w:t>
+      </w:r>
+    </w:p>
+    <w:p>
+      <w:r>
+        <w:t xml:space="preserve">F1 — </w:t>
+      </w:r>
+      <w:proofErr w:type="spellStart"/>
+      <w:r>
+        <w:t>Viết</w:t>
+      </w:r>
+      <w:proofErr w:type="spellEnd"/>
+      <w:r>
+        <w:t xml:space="preserve"> </w:t>
+      </w:r>
+      <w:proofErr w:type="spellStart"/>
+      <w:r>
+        <w:t>đánh</w:t>
+      </w:r>
+      <w:proofErr w:type="spellEnd"/>
+      <w:r>
+        <w:t xml:space="preserve"> </w:t>
+      </w:r>
+      <w:proofErr w:type="spellStart"/>
+      <w:r>
+        <w:t>giá</w:t>
+      </w:r>
+      <w:proofErr w:type="spellEnd"/>
+      <w:r>
+        <w:t xml:space="preserve"> </w:t>
+      </w:r>
+      <w:proofErr w:type="spellStart"/>
+      <w:r>
+        <w:t>sản</w:t>
+      </w:r>
+      <w:proofErr w:type="spellEnd"/>
+      <w:r>
+        <w:t xml:space="preserve"> </w:t>
+      </w:r>
+      <w:proofErr w:type="spellStart"/>
+      <w:r>
+        <w:t>phẩm</w:t>
+      </w:r>
+      <w:proofErr w:type="spellEnd"/>
     </w:p>
     <w:p>
       <w:pPr>
-        <w:pStyle w:val="ListBullet"/>
-        <w:spacing w:after="40"/>
-        <w:rPr>
-          <w:color w:val="000000" w:themeColor="text1"/>
-        </w:rPr>
+        <w:ind w:left="720"/>
       </w:pPr>
       <w:r>
-        <w:rPr>
-          <w:color w:val="000000" w:themeColor="text1"/>
-        </w:rPr>
-        <w:t>Đúng cấu trúc User Story: As a – I want – So that.</w:t>
+        <w:t xml:space="preserve">S1: </w:t>
+      </w:r>
+      <w:proofErr w:type="spellStart"/>
+      <w:r>
+        <w:t>Giữ</w:t>
+      </w:r>
+      <w:proofErr w:type="spellEnd"/>
+      <w:r>
+        <w:t xml:space="preserve"> </w:t>
+      </w:r>
+      <w:proofErr w:type="spellStart"/>
+      <w:r>
+        <w:t>nguyên</w:t>
+      </w:r>
+      <w:proofErr w:type="spellEnd"/>
+      <w:r>
+        <w:t>.</w:t>
       </w:r>
     </w:p>
     <w:p>
       <w:pPr>
-        <w:pStyle w:val="ListBullet"/>
-        <w:spacing w:after="40"/>
-        <w:rPr>
-          <w:color w:val="000000" w:themeColor="text1"/>
-        </w:rPr>
+        <w:ind w:left="720"/>
       </w:pPr>
       <w:r>
-        <w:rPr>
-          <w:color w:val="000000" w:themeColor="text1"/>
-        </w:rPr>
-        <w:t>Có giá trị nghiệp vụ rõ ràng, phạm vi nhỏ và có thể ước lượng, kiểm thử độc lập.</w:t>
+        <w:t xml:space="preserve">S2.1: </w:t>
+      </w:r>
+      <w:proofErr w:type="spellStart"/>
+      <w:r>
+        <w:t>Là</w:t>
+      </w:r>
+      <w:proofErr w:type="spellEnd"/>
+      <w:r>
+        <w:t xml:space="preserve"> </w:t>
+      </w:r>
+      <w:proofErr w:type="spellStart"/>
+      <w:r>
+        <w:t>một</w:t>
+      </w:r>
+      <w:proofErr w:type="spellEnd"/>
+      <w:r>
+        <w:t xml:space="preserve"> </w:t>
+      </w:r>
+      <w:proofErr w:type="spellStart"/>
+      <w:r>
+        <w:t>khách</w:t>
+      </w:r>
+      <w:proofErr w:type="spellEnd"/>
+      <w:r>
+        <w:t xml:space="preserve"> </w:t>
+      </w:r>
+      <w:proofErr w:type="spellStart"/>
+      <w:r>
+        <w:t>hàng</w:t>
+      </w:r>
+      <w:proofErr w:type="spellEnd"/>
+      <w:r>
+        <w:t xml:space="preserve">, </w:t>
+      </w:r>
+      <w:proofErr w:type="spellStart"/>
+      <w:r>
+        <w:t>tôi</w:t>
+      </w:r>
+      <w:proofErr w:type="spellEnd"/>
+      <w:r>
+        <w:t xml:space="preserve"> </w:t>
+      </w:r>
+      <w:proofErr w:type="spellStart"/>
+      <w:r>
+        <w:t>muốn</w:t>
+      </w:r>
+      <w:proofErr w:type="spellEnd"/>
+      <w:r>
+        <w:t xml:space="preserve"> </w:t>
+      </w:r>
+      <w:proofErr w:type="spellStart"/>
+      <w:r>
+        <w:t>viết</w:t>
+      </w:r>
+      <w:proofErr w:type="spellEnd"/>
+      <w:r>
+        <w:t xml:space="preserve"> </w:t>
+      </w:r>
+      <w:proofErr w:type="spellStart"/>
+      <w:r>
+        <w:t>bình</w:t>
+      </w:r>
+      <w:proofErr w:type="spellEnd"/>
+      <w:r>
+        <w:t xml:space="preserve"> </w:t>
+      </w:r>
+      <w:proofErr w:type="spellStart"/>
+      <w:r>
+        <w:t>luận</w:t>
+      </w:r>
+      <w:proofErr w:type="spellEnd"/>
+      <w:r>
+        <w:t xml:space="preserve"> </w:t>
+      </w:r>
+      <w:proofErr w:type="spellStart"/>
+      <w:r>
+        <w:t>cho</w:t>
+      </w:r>
+      <w:proofErr w:type="spellEnd"/>
+      <w:r>
+        <w:t xml:space="preserve"> </w:t>
+      </w:r>
+      <w:proofErr w:type="spellStart"/>
+      <w:r>
+        <w:t>sản</w:t>
+      </w:r>
+      <w:proofErr w:type="spellEnd"/>
+      <w:r>
+        <w:t xml:space="preserve"> </w:t>
+      </w:r>
+      <w:proofErr w:type="spellStart"/>
+      <w:r>
+        <w:t>phẩm</w:t>
+      </w:r>
+      <w:proofErr w:type="spellEnd"/>
+      <w:r>
+        <w:t xml:space="preserve"> </w:t>
+      </w:r>
+      <w:proofErr w:type="spellStart"/>
+      <w:r>
+        <w:t>đã</w:t>
+      </w:r>
+      <w:proofErr w:type="spellEnd"/>
+      <w:r>
+        <w:t xml:space="preserve"> </w:t>
+      </w:r>
+      <w:proofErr w:type="spellStart"/>
+      <w:r>
+        <w:t>mua</w:t>
+      </w:r>
+      <w:proofErr w:type="spellEnd"/>
+      <w:r>
+        <w:t xml:space="preserve"> </w:t>
+      </w:r>
+      <w:proofErr w:type="spellStart"/>
+      <w:r>
+        <w:t>để</w:t>
+      </w:r>
+      <w:proofErr w:type="spellEnd"/>
+      <w:r>
+        <w:t xml:space="preserve"> chia </w:t>
+      </w:r>
+      <w:proofErr w:type="spellStart"/>
+      <w:r>
+        <w:t>sẻ</w:t>
+      </w:r>
+      <w:proofErr w:type="spellEnd"/>
+      <w:r>
+        <w:t xml:space="preserve"> </w:t>
+      </w:r>
+      <w:proofErr w:type="spellStart"/>
+      <w:r>
+        <w:t>trải</w:t>
+      </w:r>
+      <w:proofErr w:type="spellEnd"/>
+      <w:r>
+        <w:t xml:space="preserve"> </w:t>
+      </w:r>
+      <w:proofErr w:type="spellStart"/>
+      <w:r>
+        <w:t>nghiệm</w:t>
+      </w:r>
+      <w:proofErr w:type="spellEnd"/>
+      <w:r>
+        <w:t xml:space="preserve"> </w:t>
+      </w:r>
+      <w:proofErr w:type="spellStart"/>
+      <w:r>
+        <w:t>sử</w:t>
+      </w:r>
+      <w:proofErr w:type="spellEnd"/>
+      <w:r>
+        <w:t xml:space="preserve"> </w:t>
+      </w:r>
+      <w:proofErr w:type="spellStart"/>
+      <w:r>
+        <w:t>dụng</w:t>
+      </w:r>
+      <w:proofErr w:type="spellEnd"/>
+      <w:r>
+        <w:t>.</w:t>
       </w:r>
     </w:p>
     <w:p>
       <w:pPr>
-        <w:pStyle w:val="ListBullet"/>
-        <w:spacing w:after="40"/>
-        <w:rPr>
-          <w:color w:val="000000" w:themeColor="text1"/>
-        </w:rPr>
+        <w:ind w:left="720"/>
       </w:pPr>
       <w:r>
-        <w:rPr>
-          <w:color w:val="000000" w:themeColor="text1"/>
-        </w:rPr>
-        <w:t>Đáp ứng cơ bản các tiêu chí INVEST: Independent, Negotiable, Valuable, Estimable, Small và Testable.</w:t>
+        <w:t xml:space="preserve">S2.2: </w:t>
+      </w:r>
+      <w:proofErr w:type="spellStart"/>
+      <w:r>
+        <w:t>Là</w:t>
+      </w:r>
+      <w:proofErr w:type="spellEnd"/>
+      <w:r>
+        <w:t xml:space="preserve"> </w:t>
+      </w:r>
+      <w:proofErr w:type="spellStart"/>
+      <w:r>
+        <w:t>một</w:t>
+      </w:r>
+      <w:proofErr w:type="spellEnd"/>
+      <w:r>
+        <w:t xml:space="preserve"> </w:t>
+      </w:r>
+      <w:proofErr w:type="spellStart"/>
+      <w:r>
+        <w:t>khách</w:t>
+      </w:r>
+      <w:proofErr w:type="spellEnd"/>
+      <w:r>
+        <w:t xml:space="preserve"> </w:t>
+      </w:r>
+      <w:proofErr w:type="spellStart"/>
+      <w:r>
+        <w:t>hàng</w:t>
+      </w:r>
+      <w:proofErr w:type="spellEnd"/>
+      <w:r>
+        <w:t xml:space="preserve">, </w:t>
+      </w:r>
+      <w:proofErr w:type="spellStart"/>
+      <w:r>
+        <w:t>tôi</w:t>
+      </w:r>
+      <w:proofErr w:type="spellEnd"/>
+      <w:r>
+        <w:t xml:space="preserve"> </w:t>
+      </w:r>
+      <w:proofErr w:type="spellStart"/>
+      <w:r>
+        <w:t>muốn</w:t>
+      </w:r>
+      <w:proofErr w:type="spellEnd"/>
+      <w:r>
+        <w:t xml:space="preserve"> </w:t>
+      </w:r>
+      <w:proofErr w:type="spellStart"/>
+      <w:r>
+        <w:t>đính</w:t>
+      </w:r>
+      <w:proofErr w:type="spellEnd"/>
+      <w:r>
+        <w:t xml:space="preserve"> </w:t>
+      </w:r>
+      <w:proofErr w:type="spellStart"/>
+      <w:r>
+        <w:t>kèm</w:t>
+      </w:r>
+      <w:proofErr w:type="spellEnd"/>
+      <w:r>
+        <w:t xml:space="preserve"> </w:t>
+      </w:r>
+      <w:proofErr w:type="spellStart"/>
+      <w:r>
+        <w:t>ảnh</w:t>
+      </w:r>
+      <w:proofErr w:type="spellEnd"/>
+      <w:r>
+        <w:t xml:space="preserve"> </w:t>
+      </w:r>
+      <w:proofErr w:type="spellStart"/>
+      <w:r>
+        <w:t>vào</w:t>
+      </w:r>
+      <w:proofErr w:type="spellEnd"/>
+      <w:r>
+        <w:t xml:space="preserve"> </w:t>
+      </w:r>
+      <w:proofErr w:type="spellStart"/>
+      <w:r>
+        <w:t>đánh</w:t>
+      </w:r>
+      <w:proofErr w:type="spellEnd"/>
+      <w:r>
+        <w:t xml:space="preserve"> </w:t>
+      </w:r>
+      <w:proofErr w:type="spellStart"/>
+      <w:r>
+        <w:t>giá</w:t>
+      </w:r>
+      <w:proofErr w:type="spellEnd"/>
+      <w:r>
+        <w:t xml:space="preserve"> </w:t>
+      </w:r>
+      <w:proofErr w:type="spellStart"/>
+      <w:r>
+        <w:t>để</w:t>
+      </w:r>
+      <w:proofErr w:type="spellEnd"/>
+      <w:r>
+        <w:t xml:space="preserve"> </w:t>
+      </w:r>
+      <w:proofErr w:type="spellStart"/>
+      <w:r>
+        <w:t>minh</w:t>
+      </w:r>
+      <w:proofErr w:type="spellEnd"/>
+      <w:r>
+        <w:t xml:space="preserve"> </w:t>
+      </w:r>
+      <w:proofErr w:type="spellStart"/>
+      <w:r>
+        <w:t>họa</w:t>
+      </w:r>
+      <w:proofErr w:type="spellEnd"/>
+      <w:r>
+        <w:t xml:space="preserve"> </w:t>
+      </w:r>
+      <w:proofErr w:type="spellStart"/>
+      <w:r>
+        <w:t>tình</w:t>
+      </w:r>
+      <w:proofErr w:type="spellEnd"/>
+      <w:r>
+        <w:t xml:space="preserve"> </w:t>
+      </w:r>
+      <w:proofErr w:type="spellStart"/>
+      <w:r>
+        <w:t>trạng</w:t>
+      </w:r>
+      <w:proofErr w:type="spellEnd"/>
+      <w:r>
+        <w:t xml:space="preserve"> </w:t>
+      </w:r>
+      <w:proofErr w:type="spellStart"/>
+      <w:r>
+        <w:t>sản</w:t>
+      </w:r>
+      <w:proofErr w:type="spellEnd"/>
+      <w:r>
+        <w:t xml:space="preserve"> </w:t>
+      </w:r>
+      <w:proofErr w:type="spellStart"/>
+      <w:r>
+        <w:t>phẩm</w:t>
+      </w:r>
+      <w:proofErr w:type="spellEnd"/>
+      <w:r>
+        <w:t xml:space="preserve"> </w:t>
+      </w:r>
+      <w:proofErr w:type="spellStart"/>
+      <w:r>
+        <w:t>thực</w:t>
+      </w:r>
+      <w:proofErr w:type="spellEnd"/>
+      <w:r>
+        <w:t xml:space="preserve"> </w:t>
+      </w:r>
+      <w:proofErr w:type="spellStart"/>
+      <w:r>
+        <w:t>tế</w:t>
+      </w:r>
+      <w:proofErr w:type="spellEnd"/>
+      <w:r>
+        <w:t>.</w:t>
       </w:r>
     </w:p>
     <w:p>
       <w:pPr>
-        <w:pStyle w:val="Heading3"/>
-        <w:rPr>
-          <w:color w:val="000000" w:themeColor="text1"/>
-        </w:rPr>
+        <w:ind w:left="720"/>
       </w:pPr>
       <w:r>
-        <w:rPr>
-          <w:color w:val="000000" w:themeColor="text1"/>
-        </w:rPr>
-        <w:t>S2 – Không hợp lệ ở cấp độ hiện tại</w:t>
+        <w:t xml:space="preserve">S2.3: </w:t>
+      </w:r>
+      <w:proofErr w:type="spellStart"/>
+      <w:r>
+        <w:t>Là</w:t>
+      </w:r>
+      <w:proofErr w:type="spellEnd"/>
+      <w:r>
+        <w:t xml:space="preserve"> </w:t>
+      </w:r>
+      <w:proofErr w:type="spellStart"/>
+      <w:r>
+        <w:t>một</w:t>
+      </w:r>
+      <w:proofErr w:type="spellEnd"/>
+      <w:r>
+        <w:t xml:space="preserve"> </w:t>
+      </w:r>
+      <w:proofErr w:type="spellStart"/>
+      <w:r>
+        <w:t>khách</w:t>
+      </w:r>
+      <w:proofErr w:type="spellEnd"/>
+      <w:r>
+        <w:t xml:space="preserve"> </w:t>
+      </w:r>
+      <w:proofErr w:type="spellStart"/>
+      <w:r>
+        <w:t>hàng</w:t>
+      </w:r>
+      <w:proofErr w:type="spellEnd"/>
+      <w:r>
+        <w:t xml:space="preserve">, </w:t>
+      </w:r>
+      <w:proofErr w:type="spellStart"/>
+      <w:r>
+        <w:t>tôi</w:t>
+      </w:r>
+      <w:proofErr w:type="spellEnd"/>
+      <w:r>
+        <w:t xml:space="preserve"> </w:t>
+      </w:r>
+      <w:proofErr w:type="spellStart"/>
+      <w:r>
+        <w:t>muốn</w:t>
+      </w:r>
+      <w:proofErr w:type="spellEnd"/>
+      <w:r>
+        <w:t xml:space="preserve"> </w:t>
+      </w:r>
+      <w:proofErr w:type="spellStart"/>
+      <w:r>
+        <w:t>gửi</w:t>
+      </w:r>
+      <w:proofErr w:type="spellEnd"/>
+      <w:r>
+        <w:t xml:space="preserve"> </w:t>
+      </w:r>
+      <w:proofErr w:type="spellStart"/>
+      <w:r>
+        <w:t>đánh</w:t>
+      </w:r>
+      <w:proofErr w:type="spellEnd"/>
+      <w:r>
+        <w:t xml:space="preserve"> </w:t>
+      </w:r>
+      <w:proofErr w:type="spellStart"/>
+      <w:r>
+        <w:t>giá</w:t>
+      </w:r>
+      <w:proofErr w:type="spellEnd"/>
+      <w:r>
+        <w:t xml:space="preserve"> </w:t>
+      </w:r>
+      <w:proofErr w:type="spellStart"/>
+      <w:r>
+        <w:t>sau</w:t>
+      </w:r>
+      <w:proofErr w:type="spellEnd"/>
+      <w:r>
+        <w:t xml:space="preserve"> </w:t>
+      </w:r>
+      <w:proofErr w:type="spellStart"/>
+      <w:r>
+        <w:t>khi</w:t>
+      </w:r>
+      <w:proofErr w:type="spellEnd"/>
+      <w:r>
+        <w:t xml:space="preserve"> </w:t>
+      </w:r>
+      <w:proofErr w:type="spellStart"/>
+      <w:r>
+        <w:t>hoàn</w:t>
+      </w:r>
+      <w:proofErr w:type="spellEnd"/>
+      <w:r>
+        <w:t xml:space="preserve"> </w:t>
+      </w:r>
+      <w:proofErr w:type="spellStart"/>
+      <w:r>
+        <w:t>tất</w:t>
+      </w:r>
+      <w:proofErr w:type="spellEnd"/>
+      <w:r>
+        <w:t xml:space="preserve"> </w:t>
+      </w:r>
+      <w:proofErr w:type="spellStart"/>
+      <w:r>
+        <w:t>nội</w:t>
+      </w:r>
+      <w:proofErr w:type="spellEnd"/>
+      <w:r>
+        <w:t xml:space="preserve"> dung </w:t>
+      </w:r>
+      <w:proofErr w:type="spellStart"/>
+      <w:r>
+        <w:t>để</w:t>
+      </w:r>
+      <w:proofErr w:type="spellEnd"/>
+      <w:r>
+        <w:t xml:space="preserve"> chia </w:t>
+      </w:r>
+      <w:proofErr w:type="spellStart"/>
+      <w:r>
+        <w:t>sẻ</w:t>
+      </w:r>
+      <w:proofErr w:type="spellEnd"/>
+      <w:r>
+        <w:t xml:space="preserve"> </w:t>
+      </w:r>
+      <w:proofErr w:type="spellStart"/>
+      <w:r>
+        <w:t>nhận</w:t>
+      </w:r>
+      <w:proofErr w:type="spellEnd"/>
+      <w:r>
+        <w:t xml:space="preserve"> </w:t>
+      </w:r>
+      <w:proofErr w:type="spellStart"/>
+      <w:r>
+        <w:t>xét</w:t>
+      </w:r>
+      <w:proofErr w:type="spellEnd"/>
+      <w:r>
+        <w:t xml:space="preserve"> </w:t>
+      </w:r>
+      <w:proofErr w:type="spellStart"/>
+      <w:r>
+        <w:t>với</w:t>
+      </w:r>
+      <w:proofErr w:type="spellEnd"/>
+      <w:r>
+        <w:t xml:space="preserve"> </w:t>
+      </w:r>
+      <w:proofErr w:type="spellStart"/>
+      <w:r>
+        <w:t>người</w:t>
+      </w:r>
+      <w:proofErr w:type="spellEnd"/>
+      <w:r>
+        <w:t xml:space="preserve"> </w:t>
+      </w:r>
+      <w:proofErr w:type="spellStart"/>
+      <w:r>
+        <w:t>mua</w:t>
+      </w:r>
+      <w:proofErr w:type="spellEnd"/>
+      <w:r>
+        <w:t xml:space="preserve"> </w:t>
+      </w:r>
+      <w:proofErr w:type="spellStart"/>
+      <w:r>
+        <w:t>khác</w:t>
+      </w:r>
+      <w:proofErr w:type="spellEnd"/>
+      <w:r>
+        <w:t>.</w:t>
       </w:r>
     </w:p>
     <w:p>
       <w:pPr>
-        <w:rPr>
-          <w:color w:val="000000" w:themeColor="text1"/>
-        </w:rPr>
+        <w:ind w:left="720"/>
       </w:pPr>
       <w:r>
-        <w:rPr>
-          <w:color w:val="000000" w:themeColor="text1"/>
-        </w:rPr>
-        <w:t>“Cho phép khách chấm sao, viết bình luận, đính kèm ảnh, gửi đánh giá, hệ thống kiểm duyệt nội dung, rồi hiển thị công khai lên trang sản phẩm.”</w:t>
-      </w:r>
+        <w:t>S3: Là qu</w:t>
+      </w:r>
+      <w:proofErr w:type="spellStart"/>
+      <w:r>
+        <w:t>ản</w:t>
+      </w:r>
+      <w:proofErr w:type="spellEnd"/>
+      <w:r>
+        <w:t xml:space="preserve"> </w:t>
+      </w:r>
+      <w:proofErr w:type="spellStart"/>
+      <w:r>
+        <w:t>trị</w:t>
+      </w:r>
+      <w:proofErr w:type="spellEnd"/>
+      <w:r>
+        <w:t xml:space="preserve"> </w:t>
+      </w:r>
+      <w:proofErr w:type="spellStart"/>
+      <w:r>
+        <w:t>viên</w:t>
+      </w:r>
+      <w:proofErr w:type="spellEnd"/>
+      <w:r>
+        <w:t xml:space="preserve">, </w:t>
+      </w:r>
+      <w:proofErr w:type="spellStart"/>
+      <w:r>
+        <w:t>tôi</w:t>
+      </w:r>
+      <w:proofErr w:type="spellEnd"/>
+      <w:r>
+        <w:t xml:space="preserve"> </w:t>
+      </w:r>
+      <w:proofErr w:type="spellStart"/>
+      <w:r>
+        <w:t>muốn</w:t>
+      </w:r>
+      <w:proofErr w:type="spellEnd"/>
+      <w:r>
+        <w:t xml:space="preserve"> </w:t>
+      </w:r>
+      <w:proofErr w:type="spellStart"/>
+      <w:r>
+        <w:t>kiểm</w:t>
+      </w:r>
+      <w:proofErr w:type="spellEnd"/>
+      <w:r>
+        <w:t xml:space="preserve"> </w:t>
+      </w:r>
+      <w:proofErr w:type="spellStart"/>
+      <w:r>
+        <w:t>duyệt</w:t>
+      </w:r>
+      <w:proofErr w:type="spellEnd"/>
+      <w:r>
+        <w:t xml:space="preserve"> </w:t>
+      </w:r>
+      <w:proofErr w:type="spellStart"/>
+      <w:r>
+        <w:t>đánh</w:t>
+      </w:r>
+      <w:proofErr w:type="spellEnd"/>
+      <w:r>
+        <w:t xml:space="preserve"> </w:t>
+      </w:r>
+      <w:proofErr w:type="spellStart"/>
+      <w:r>
+        <w:t>giá</w:t>
+      </w:r>
+      <w:proofErr w:type="spellEnd"/>
+      <w:r>
+        <w:t xml:space="preserve"> </w:t>
+      </w:r>
+      <w:proofErr w:type="spellStart"/>
+      <w:r>
+        <w:t>của</w:t>
+      </w:r>
+      <w:proofErr w:type="spellEnd"/>
+      <w:r>
+        <w:t xml:space="preserve"> </w:t>
+      </w:r>
+      <w:proofErr w:type="spellStart"/>
+      <w:r>
+        <w:t>khách</w:t>
+      </w:r>
+      <w:proofErr w:type="spellEnd"/>
+      <w:r>
+        <w:t xml:space="preserve"> </w:t>
+      </w:r>
+      <w:proofErr w:type="spellStart"/>
+      <w:r>
+        <w:t>hàng</w:t>
+      </w:r>
+      <w:proofErr w:type="spellEnd"/>
+      <w:r>
+        <w:t xml:space="preserve"> </w:t>
+      </w:r>
+      <w:proofErr w:type="spellStart"/>
+      <w:r>
+        <w:t>để</w:t>
+      </w:r>
+      <w:proofErr w:type="spellEnd"/>
+      <w:r>
+        <w:t xml:space="preserve"> </w:t>
+      </w:r>
+      <w:proofErr w:type="spellStart"/>
+      <w:r>
+        <w:t>ngăn</w:t>
+      </w:r>
+      <w:proofErr w:type="spellEnd"/>
+      <w:r>
+        <w:t xml:space="preserve"> </w:t>
+      </w:r>
+      <w:proofErr w:type="spellStart"/>
+      <w:r>
+        <w:t>nội</w:t>
+      </w:r>
+      <w:proofErr w:type="spellEnd"/>
+      <w:r>
+        <w:t xml:space="preserve"> dung vi </w:t>
+      </w:r>
+      <w:proofErr w:type="spellStart"/>
+      <w:r>
+        <w:t>phạm</w:t>
+      </w:r>
+      <w:proofErr w:type="spellEnd"/>
+      <w:r>
+        <w:t xml:space="preserve"> </w:t>
+      </w:r>
+      <w:proofErr w:type="spellStart"/>
+      <w:r>
+        <w:t>được</w:t>
+      </w:r>
+      <w:proofErr w:type="spellEnd"/>
+      <w:r>
+        <w:t xml:space="preserve"> </w:t>
+      </w:r>
+      <w:proofErr w:type="spellStart"/>
+      <w:r>
+        <w:t>công</w:t>
+      </w:r>
+      <w:proofErr w:type="spellEnd"/>
+      <w:r>
+        <w:t xml:space="preserve"> </w:t>
+      </w:r>
+      <w:proofErr w:type="spellStart"/>
+      <w:r>
+        <w:t>khai</w:t>
+      </w:r>
+      <w:proofErr w:type="spellEnd"/>
+      <w:r>
+        <w:t>.</w:t>
+      </w:r>
+    </w:p>
+    <w:p>
+      <w:r>
+        <w:t xml:space="preserve">F2 — Xem </w:t>
+      </w:r>
+      <w:proofErr w:type="spellStart"/>
+      <w:r>
+        <w:t>đánh</w:t>
+      </w:r>
+      <w:proofErr w:type="spellEnd"/>
+      <w:r>
+        <w:t xml:space="preserve"> </w:t>
+      </w:r>
+      <w:proofErr w:type="spellStart"/>
+      <w:r>
+        <w:t>giá</w:t>
+      </w:r>
+      <w:proofErr w:type="spellEnd"/>
+      <w:r>
+        <w:t xml:space="preserve"> </w:t>
+      </w:r>
+      <w:proofErr w:type="spellStart"/>
+      <w:r>
+        <w:t>sản</w:t>
+      </w:r>
+      <w:proofErr w:type="spellEnd"/>
+      <w:r>
+        <w:t xml:space="preserve"> </w:t>
+      </w:r>
+      <w:proofErr w:type="spellStart"/>
+      <w:r>
+        <w:t>phẩm</w:t>
+      </w:r>
+      <w:proofErr w:type="spellEnd"/>
     </w:p>
     <w:p>
       <w:pPr>
-        <w:pStyle w:val="ListBullet"/>
-        <w:spacing w:after="40"/>
-        <w:rPr>
-          <w:color w:val="000000" w:themeColor="text1"/>
-        </w:rPr>
+        <w:ind w:left="720"/>
       </w:pPr>
       <w:r>
-        <w:rPr>
-          <w:color w:val="000000" w:themeColor="text1"/>
-        </w:rPr>
-        <w:t>S2 gộp nhiều chức năng và bước quy trình vào một mục: chấm sao, viết bình luận, đính kèm ảnh, gửi đánh giá, kiểm duyệt và hiển thị công khai.</w:t>
+        <w:t xml:space="preserve">S4: </w:t>
+      </w:r>
+      <w:proofErr w:type="spellStart"/>
+      <w:r>
+        <w:t>Là</w:t>
+      </w:r>
+      <w:proofErr w:type="spellEnd"/>
+      <w:r>
+        <w:t xml:space="preserve"> </w:t>
+      </w:r>
+      <w:proofErr w:type="spellStart"/>
+      <w:r>
+        <w:t>một</w:t>
+      </w:r>
+      <w:proofErr w:type="spellEnd"/>
+      <w:r>
+        <w:t xml:space="preserve"> </w:t>
+      </w:r>
+      <w:proofErr w:type="spellStart"/>
+      <w:r>
+        <w:t>khách</w:t>
+      </w:r>
+      <w:proofErr w:type="spellEnd"/>
+      <w:r>
+        <w:t xml:space="preserve"> </w:t>
+      </w:r>
+      <w:proofErr w:type="spellStart"/>
+      <w:r>
+        <w:t>hàng</w:t>
+      </w:r>
+      <w:proofErr w:type="spellEnd"/>
+      <w:r>
+        <w:t xml:space="preserve">, </w:t>
+      </w:r>
+      <w:proofErr w:type="spellStart"/>
+      <w:r>
+        <w:t>tôi</w:t>
+      </w:r>
+      <w:proofErr w:type="spellEnd"/>
+      <w:r>
+        <w:t xml:space="preserve"> </w:t>
+      </w:r>
+      <w:proofErr w:type="spellStart"/>
+      <w:r>
+        <w:t>muốn</w:t>
+      </w:r>
+      <w:proofErr w:type="spellEnd"/>
+      <w:r>
+        <w:t xml:space="preserve"> </w:t>
+      </w:r>
+      <w:proofErr w:type="spellStart"/>
+      <w:r>
+        <w:t>xem</w:t>
+      </w:r>
+      <w:proofErr w:type="spellEnd"/>
+      <w:r>
+        <w:t xml:space="preserve"> </w:t>
+      </w:r>
+      <w:proofErr w:type="spellStart"/>
+      <w:r>
+        <w:t>điểm</w:t>
+      </w:r>
+      <w:proofErr w:type="spellEnd"/>
+      <w:r>
+        <w:t xml:space="preserve"> </w:t>
+      </w:r>
+      <w:proofErr w:type="spellStart"/>
+      <w:r>
+        <w:t>đánh</w:t>
+      </w:r>
+      <w:proofErr w:type="spellEnd"/>
+      <w:r>
+        <w:t xml:space="preserve"> </w:t>
+      </w:r>
+      <w:proofErr w:type="spellStart"/>
+      <w:r>
+        <w:t>giá</w:t>
+      </w:r>
+      <w:proofErr w:type="spellEnd"/>
+      <w:r>
+        <w:t xml:space="preserve"> </w:t>
+      </w:r>
+      <w:proofErr w:type="spellStart"/>
+      <w:r>
+        <w:t>trung</w:t>
+      </w:r>
+      <w:proofErr w:type="spellEnd"/>
+      <w:r>
+        <w:t xml:space="preserve"> </w:t>
+      </w:r>
+      <w:proofErr w:type="spellStart"/>
+      <w:r>
+        <w:t>bình</w:t>
+      </w:r>
+      <w:proofErr w:type="spellEnd"/>
+      <w:r>
+        <w:t xml:space="preserve"> </w:t>
+      </w:r>
+      <w:proofErr w:type="spellStart"/>
+      <w:r>
+        <w:t>của</w:t>
+      </w:r>
+      <w:proofErr w:type="spellEnd"/>
+      <w:r>
+        <w:t xml:space="preserve"> </w:t>
+      </w:r>
+      <w:proofErr w:type="spellStart"/>
+      <w:r>
+        <w:t>sản</w:t>
+      </w:r>
+      <w:proofErr w:type="spellEnd"/>
+      <w:r>
+        <w:t xml:space="preserve"> </w:t>
+      </w:r>
+      <w:proofErr w:type="spellStart"/>
+      <w:r>
+        <w:t>phẩm</w:t>
+      </w:r>
+      <w:proofErr w:type="spellEnd"/>
+      <w:r>
+        <w:t xml:space="preserve"> </w:t>
+      </w:r>
+      <w:proofErr w:type="spellStart"/>
+      <w:r>
+        <w:t>để</w:t>
+      </w:r>
+      <w:proofErr w:type="spellEnd"/>
+      <w:r>
+        <w:t xml:space="preserve"> </w:t>
+      </w:r>
+      <w:proofErr w:type="spellStart"/>
+      <w:r>
+        <w:t>cân</w:t>
+      </w:r>
+      <w:proofErr w:type="spellEnd"/>
+      <w:r>
+        <w:t xml:space="preserve"> </w:t>
+      </w:r>
+      <w:proofErr w:type="spellStart"/>
+      <w:r>
+        <w:t>nhắc</w:t>
+      </w:r>
+      <w:proofErr w:type="spellEnd"/>
+      <w:r>
+        <w:t xml:space="preserve"> </w:t>
+      </w:r>
+      <w:proofErr w:type="spellStart"/>
+      <w:r>
+        <w:t>trước</w:t>
+      </w:r>
+      <w:proofErr w:type="spellEnd"/>
+      <w:r>
+        <w:t xml:space="preserve"> </w:t>
+      </w:r>
+      <w:proofErr w:type="spellStart"/>
+      <w:r>
+        <w:t>khi</w:t>
+      </w:r>
+      <w:proofErr w:type="spellEnd"/>
+      <w:r>
+        <w:t xml:space="preserve"> </w:t>
+      </w:r>
+      <w:proofErr w:type="spellStart"/>
+      <w:r>
+        <w:t>mua</w:t>
+      </w:r>
+      <w:proofErr w:type="spellEnd"/>
+      <w:r>
+        <w:t>.</w:t>
       </w:r>
     </w:p>
     <w:p>
       <w:pPr>
-        <w:pStyle w:val="ListBullet"/>
-        <w:spacing w:after="40"/>
-        <w:rPr>
-          <w:color w:val="000000" w:themeColor="text1"/>
-        </w:rPr>
+        <w:ind w:left="720"/>
       </w:pPr>
       <w:r>
-        <w:rPr>
-          <w:color w:val="000000" w:themeColor="text1"/>
-        </w:rPr>
-        <w:t>Vi phạm nguyên tắc phân cấp Backlog vì không phải một User Story nhỏ, rõ ràng; cũng chưa dùng cấu trúc As a – I want – So that.</w:t>
+        <w:t>S5: Là m</w:t>
+      </w:r>
+      <w:proofErr w:type="spellStart"/>
+      <w:r>
+        <w:t>ột</w:t>
+      </w:r>
+      <w:proofErr w:type="spellEnd"/>
+      <w:r>
+        <w:t xml:space="preserve"> </w:t>
+      </w:r>
+      <w:proofErr w:type="spellStart"/>
+      <w:r>
+        <w:t>khách</w:t>
+      </w:r>
+      <w:proofErr w:type="spellEnd"/>
+      <w:r>
+        <w:t xml:space="preserve"> </w:t>
+      </w:r>
+      <w:proofErr w:type="spellStart"/>
+      <w:r>
+        <w:t>hàng</w:t>
+      </w:r>
+      <w:proofErr w:type="spellEnd"/>
+      <w:r>
+        <w:t xml:space="preserve">, </w:t>
+      </w:r>
+      <w:proofErr w:type="spellStart"/>
+      <w:r>
+        <w:t>tôi</w:t>
+      </w:r>
+      <w:proofErr w:type="spellEnd"/>
+      <w:r>
+        <w:t xml:space="preserve"> </w:t>
+      </w:r>
+      <w:proofErr w:type="spellStart"/>
+      <w:r>
+        <w:t>muốn</w:t>
+      </w:r>
+      <w:proofErr w:type="spellEnd"/>
+      <w:r>
+        <w:t xml:space="preserve"> </w:t>
+      </w:r>
+      <w:proofErr w:type="spellStart"/>
+      <w:r>
+        <w:t>đọc</w:t>
+      </w:r>
+      <w:proofErr w:type="spellEnd"/>
+      <w:r>
+        <w:t xml:space="preserve"> </w:t>
+      </w:r>
+      <w:proofErr w:type="spellStart"/>
+      <w:r>
+        <w:t>các</w:t>
+      </w:r>
+      <w:proofErr w:type="spellEnd"/>
+      <w:r>
+        <w:t xml:space="preserve"> </w:t>
+      </w:r>
+      <w:proofErr w:type="spellStart"/>
+      <w:r>
+        <w:t>đánh</w:t>
+      </w:r>
+      <w:proofErr w:type="spellEnd"/>
+      <w:r>
+        <w:t xml:space="preserve"> </w:t>
+      </w:r>
+      <w:proofErr w:type="spellStart"/>
+      <w:r>
+        <w:t>giá</w:t>
+      </w:r>
+      <w:proofErr w:type="spellEnd"/>
+      <w:r>
+        <w:t xml:space="preserve"> </w:t>
+      </w:r>
+      <w:proofErr w:type="spellStart"/>
+      <w:r>
+        <w:t>của</w:t>
+      </w:r>
+      <w:proofErr w:type="spellEnd"/>
+      <w:r>
+        <w:t xml:space="preserve"> </w:t>
+      </w:r>
+      <w:proofErr w:type="spellStart"/>
+      <w:r>
+        <w:t>người</w:t>
+      </w:r>
+      <w:proofErr w:type="spellEnd"/>
+      <w:r>
+        <w:t xml:space="preserve"> </w:t>
+      </w:r>
+      <w:proofErr w:type="spellStart"/>
+      <w:r>
+        <w:t>mua</w:t>
+      </w:r>
+      <w:proofErr w:type="spellEnd"/>
+      <w:r>
+        <w:t xml:space="preserve"> </w:t>
+      </w:r>
+      <w:proofErr w:type="spellStart"/>
+      <w:r>
+        <w:t>trước</w:t>
+      </w:r>
+      <w:proofErr w:type="spellEnd"/>
+      <w:r>
+        <w:t xml:space="preserve"> </w:t>
+      </w:r>
+      <w:proofErr w:type="spellStart"/>
+      <w:r>
+        <w:t>để</w:t>
+      </w:r>
+      <w:proofErr w:type="spellEnd"/>
+      <w:r>
+        <w:t xml:space="preserve"> </w:t>
+      </w:r>
+      <w:proofErr w:type="spellStart"/>
+      <w:r>
+        <w:t>có</w:t>
+      </w:r>
+      <w:proofErr w:type="spellEnd"/>
+      <w:r>
+        <w:t xml:space="preserve"> </w:t>
+      </w:r>
+      <w:proofErr w:type="spellStart"/>
+      <w:r>
+        <w:t>thêm</w:t>
+      </w:r>
+      <w:proofErr w:type="spellEnd"/>
+      <w:r>
+        <w:t xml:space="preserve"> </w:t>
+      </w:r>
+      <w:proofErr w:type="spellStart"/>
+      <w:r>
+        <w:t>thông</w:t>
+      </w:r>
+      <w:proofErr w:type="spellEnd"/>
+      <w:r>
+        <w:t xml:space="preserve"> tin </w:t>
+      </w:r>
+      <w:proofErr w:type="spellStart"/>
+      <w:r>
+        <w:t>về</w:t>
+      </w:r>
+      <w:proofErr w:type="spellEnd"/>
+      <w:r>
+        <w:t xml:space="preserve"> </w:t>
+      </w:r>
+      <w:proofErr w:type="spellStart"/>
+      <w:r>
+        <w:t>chất</w:t>
+      </w:r>
+      <w:proofErr w:type="spellEnd"/>
+      <w:r>
+        <w:t xml:space="preserve"> </w:t>
+      </w:r>
+      <w:proofErr w:type="spellStart"/>
+      <w:r>
+        <w:t>lượng</w:t>
+      </w:r>
+      <w:proofErr w:type="spellEnd"/>
+      <w:r>
+        <w:t xml:space="preserve"> </w:t>
+      </w:r>
+      <w:proofErr w:type="spellStart"/>
+      <w:r>
+        <w:t>sản</w:t>
+      </w:r>
+      <w:proofErr w:type="spellEnd"/>
+      <w:r>
+        <w:t xml:space="preserve"> </w:t>
+      </w:r>
+      <w:proofErr w:type="spellStart"/>
+      <w:r>
+        <w:t>phẩm</w:t>
+      </w:r>
+      <w:proofErr w:type="spellEnd"/>
+      <w:r>
+        <w:t>.</w:t>
       </w:r>
     </w:p>
-    <w:p>
-      <w:pPr>
-        <w:pStyle w:val="ListBullet"/>
-        <w:spacing w:after="40"/>
-        <w:rPr>
-          <w:color w:val="000000" w:themeColor="text1"/>
-        </w:rPr>
-      </w:pPr>
-      <w:r>
-        <w:rPr>
-          <w:color w:val="000000" w:themeColor="text1"/>
-        </w:rPr>
-        <w:t>Chưa đáp ứng tốt các tiêu chí INVEST về Estimable, Small và Testable do phạm vi lớn, khó ước lượng và khó xác định điều kiện nghiệm thu tổng thể.</w:t>
-      </w:r>
-    </w:p>
-    <w:p>
-      <w:pPr>
-        <w:pStyle w:val="Heading2"/>
-        <w:rPr>
-          <w:color w:val="000000" w:themeColor="text1"/>
-        </w:rPr>
-      </w:pPr>
-      <w:r>
-        <w:rPr>
-          <w:color w:val="000000" w:themeColor="text1"/>
-        </w:rPr>
-        <w:t>2. Vì sao không thể đưa S2 trực tiếp vào Sprint?</w:t>
-      </w:r>
-    </w:p>
-    <w:p>
-      <w:pPr>
-        <w:pStyle w:val="ListNumber"/>
-        <w:spacing w:after="40"/>
-        <w:rPr>
-          <w:color w:val="000000" w:themeColor="text1"/>
-        </w:rPr>
-      </w:pPr>
-      <w:r>
-        <w:rPr>
-          <w:color w:val="000000" w:themeColor="text1"/>
-        </w:rPr>
-        <w:t>Phạm vi quá lớn: khó xác định chính xác khối lượng công việc.</w:t>
-      </w:r>
-    </w:p>
-    <w:p>
-      <w:pPr>
-        <w:pStyle w:val="ListNumber"/>
-        <w:spacing w:after="40"/>
-        <w:rPr>
-          <w:color w:val="000000" w:themeColor="text1"/>
-        </w:rPr>
-      </w:pPr>
-      <w:r>
-        <w:rPr>
-          <w:color w:val="000000" w:themeColor="text1"/>
-        </w:rPr>
-        <w:t>Khó ước lượng: các chức năng có độ phức tạp kỹ thuật khác nhau.</w:t>
-      </w:r>
-    </w:p>
-    <w:p>
-      <w:pPr>
-        <w:pStyle w:val="ListNumber"/>
-        <w:spacing w:after="40"/>
-        <w:rPr>
-          <w:color w:val="000000" w:themeColor="text1"/>
-        </w:rPr>
-      </w:pPr>
-      <w:r>
-        <w:rPr>
-          <w:color w:val="000000" w:themeColor="text1"/>
-        </w:rPr>
-        <w:t>Khó kiểm thử: một phần hoàn thành không có nghĩa toàn bộ Story đã hoàn thành.</w:t>
-      </w:r>
-    </w:p>
-    <w:p>
-      <w:pPr>
-        <w:pStyle w:val="ListNumber"/>
-        <w:spacing w:after="40"/>
-        <w:rPr>
-          <w:color w:val="000000" w:themeColor="text1"/>
-        </w:rPr>
-      </w:pPr>
-      <w:r>
-        <w:rPr>
-          <w:color w:val="000000" w:themeColor="text1"/>
-        </w:rPr>
-        <w:t>Khó ưu tiên: Product Owner không dễ quyết định chức năng nào cần làm trước.</w:t>
-      </w:r>
-    </w:p>
-    <w:p>
-      <w:pPr>
-        <w:pStyle w:val="ListNumber"/>
-        <w:spacing w:after="40"/>
-        <w:rPr>
-          <w:color w:val="000000" w:themeColor="text1"/>
-        </w:rPr>
-      </w:pPr>
-      <w:r>
-        <w:rPr>
-          <w:color w:val="000000" w:themeColor="text1"/>
-        </w:rPr>
-        <w:t>Khó nghiệm thu: chưa có tiêu chí chấp nhận riêng cho từng chức năng.</w:t>
-      </w:r>
-    </w:p>
-    <w:p>
-      <w:pPr>
-        <w:rPr>
-          <w:color w:val="000000" w:themeColor="text1"/>
-        </w:rPr>
-      </w:pPr>
-      <w:r>
-        <w:rPr>
-          <w:color w:val="000000" w:themeColor="text1"/>
-        </w:rPr>
-        <w:t>Kết luận: Cần tách S2 thành các User Story nhỏ hơn, mỗi Story có giá trị nghiệp vụ và có thể ước lượng, kiểm thử riêng.</w:t>
-      </w:r>
-    </w:p>
-    <w:p>
-      <w:pPr>
-        <w:pStyle w:val="Heading1"/>
-        <w:rPr>
-          <w:color w:val="000000" w:themeColor="text1"/>
-        </w:rPr>
-      </w:pPr>
-      <w:r>
-        <w:rPr>
-          <w:color w:val="000000" w:themeColor="text1"/>
-        </w:rPr>
-        <w:t>PHẦN B. HOÀN THIỆN BACKLOG CHUẨN</w:t>
-      </w:r>
-    </w:p>
-    <w:p>
-      <w:pPr>
-        <w:pStyle w:val="Heading2"/>
-        <w:rPr>
-          <w:color w:val="000000" w:themeColor="text1"/>
-        </w:rPr>
-      </w:pPr>
-      <w:r>
-        <w:rPr>
-          <w:color w:val="000000" w:themeColor="text1"/>
-        </w:rPr>
-        <w:t>1. Cấu trúc Epic → Feature → User Story</w:t>
-      </w:r>
-    </w:p>
-    <w:p>
-      <w:pPr>
-        <w:rPr>
-          <w:color w:val="000000" w:themeColor="text1"/>
-        </w:rPr>
-      </w:pPr>
-      <w:r>
-        <w:rPr>
-          <w:color w:val="000000" w:themeColor="text1"/>
-        </w:rPr>
-        <w:t>Epic: Đánh giá &amp; Nhận xét sản phẩm</w:t>
-      </w:r>
-    </w:p>
-    <w:p>
-      <w:pPr>
-        <w:pStyle w:val="Heading3"/>
-        <w:rPr>
-          <w:color w:val="000000" w:themeColor="text1"/>
-        </w:rPr>
-      </w:pPr>
-      <w:r>
-        <w:rPr>
-          <w:color w:val="000000" w:themeColor="text1"/>
-        </w:rPr>
-        <w:t>F1 – Viết đánh giá sản phẩm</w:t>
-      </w:r>
-    </w:p>
-    <w:p>
-      <w:pPr>
-        <w:pStyle w:val="ListBullet"/>
-        <w:spacing w:after="40"/>
-        <w:rPr>
-          <w:color w:val="000000" w:themeColor="text1"/>
-        </w:rPr>
-      </w:pPr>
-      <w:r>
-        <w:rPr>
-          <w:color w:val="000000" w:themeColor="text1"/>
-        </w:rPr>
-        <w:t>S1 – Chấm sao cho sản phẩm đã mua.</w:t>
-      </w:r>
-    </w:p>
-    <w:p>
-      <w:pPr>
-        <w:pStyle w:val="ListBullet"/>
-        <w:spacing w:after="40"/>
-        <w:rPr>
-          <w:color w:val="000000" w:themeColor="text1"/>
-        </w:rPr>
-      </w:pPr>
-      <w:r>
-        <w:rPr>
-          <w:color w:val="000000" w:themeColor="text1"/>
-        </w:rPr>
-        <w:t>S2.1 – Viết bình luận đánh giá.</w:t>
-      </w:r>
-    </w:p>
-    <w:p>
-      <w:pPr>
-        <w:pStyle w:val="ListBullet"/>
-        <w:spacing w:after="40"/>
-        <w:rPr>
-          <w:color w:val="000000" w:themeColor="text1"/>
-        </w:rPr>
-      </w:pPr>
-      <w:r>
-        <w:rPr>
-          <w:color w:val="000000" w:themeColor="text1"/>
-        </w:rPr>
-        <w:t>S2.2 – Đính kèm ảnh vào đánh giá.</w:t>
-      </w:r>
-    </w:p>
-    <w:p>
-      <w:pPr>
-        <w:pStyle w:val="ListBullet"/>
-        <w:spacing w:after="40"/>
-        <w:rPr>
-          <w:color w:val="000000" w:themeColor="text1"/>
-        </w:rPr>
-      </w:pPr>
-      <w:r>
-        <w:rPr>
-          <w:color w:val="000000" w:themeColor="text1"/>
-        </w:rPr>
-        <w:t>S2.3 – Gửi đánh giá để kiểm duyệt.</w:t>
-      </w:r>
-    </w:p>
-    <w:p>
-      <w:pPr>
-        <w:pStyle w:val="ListBullet"/>
-        <w:spacing w:after="40"/>
-        <w:rPr>
-          <w:color w:val="000000" w:themeColor="text1"/>
-        </w:rPr>
-      </w:pPr>
-      <w:r>
-        <w:rPr>
-          <w:color w:val="000000" w:themeColor="text1"/>
-        </w:rPr>
-        <w:t>S3 – Chỉnh sửa đánh giá của mình.</w:t>
-      </w:r>
-    </w:p>
-    <w:p>
-      <w:pPr>
-        <w:pStyle w:val="Heading3"/>
-        <w:rPr>
-          <w:color w:val="000000" w:themeColor="text1"/>
-        </w:rPr>
-      </w:pPr>
-      <w:r>
-        <w:rPr>
-          <w:color w:val="000000" w:themeColor="text1"/>
-        </w:rPr>
-        <w:t>F2 – Xem đánh giá và xếp hạng sản phẩm</w:t>
-      </w:r>
-    </w:p>
-    <w:p>
-      <w:pPr>
-        <w:pStyle w:val="ListBullet"/>
-        <w:spacing w:after="40"/>
-        <w:rPr>
-          <w:color w:val="000000" w:themeColor="text1"/>
-        </w:rPr>
-      </w:pPr>
-      <w:r>
-        <w:rPr>
-          <w:color w:val="000000" w:themeColor="text1"/>
-        </w:rPr>
-        <w:t>S4 – Xem điểm đánh giá trung bình.</w:t>
-      </w:r>
-    </w:p>
-    <w:p>
-      <w:pPr>
-        <w:pStyle w:val="ListBullet"/>
-        <w:spacing w:after="40"/>
-        <w:rPr>
-          <w:color w:val="000000" w:themeColor="text1"/>
-        </w:rPr>
-      </w:pPr>
-      <w:r>
-        <w:rPr>
-          <w:color w:val="000000" w:themeColor="text1"/>
-        </w:rPr>
-        <w:lastRenderedPageBreak/>
-        <w:t>S5 – Xem danh sách đánh giá của khách hàng.</w:t>
-      </w:r>
-    </w:p>
-    <w:p>
-      <w:pPr>
-        <w:pStyle w:val="Heading2"/>
-        <w:rPr>
-          <w:color w:val="000000" w:themeColor="text1"/>
-        </w:rPr>
-      </w:pPr>
-      <w:r>
-        <w:rPr>
-          <w:color w:val="000000" w:themeColor="text1"/>
-        </w:rPr>
-        <w:t>2. User Story S3 – Chỉnh sửa đánh giá của mình</w:t>
-      </w:r>
-    </w:p>
-    <w:p>
-      <w:pPr>
-        <w:rPr>
-          <w:color w:val="000000" w:themeColor="text1"/>
-        </w:rPr>
-      </w:pPr>
-      <w:r>
-        <w:rPr>
-          <w:color w:val="000000" w:themeColor="text1"/>
-        </w:rPr>
-        <w:t>As a khách hàng đã gửi đánh giá, I want chỉnh sửa nội dung và số sao của đánh giá của mình, so that tôi có thể cập nhật nhận xét khi trải nghiệm sản phẩm thay đổi.</w:t>
-      </w:r>
-    </w:p>
-    <w:p>
-      <w:pPr>
-        <w:rPr>
-          <w:color w:val="000000" w:themeColor="text1"/>
-        </w:rPr>
-      </w:pPr>
-      <w:r>
-        <w:rPr>
-          <w:color w:val="000000" w:themeColor="text1"/>
-        </w:rPr>
-        <w:t>Tiêu chí chấp nhận:</w:t>
-      </w:r>
-    </w:p>
-    <w:p>
-      <w:pPr>
-        <w:pStyle w:val="ListBullet"/>
-        <w:spacing w:after="40"/>
-        <w:rPr>
-          <w:color w:val="000000" w:themeColor="text1"/>
-        </w:rPr>
-      </w:pPr>
-      <w:r>
-        <w:rPr>
-          <w:color w:val="000000" w:themeColor="text1"/>
-        </w:rPr>
-        <w:t>Khách hàng chỉ được chỉnh sửa đánh giá thuộc tài khoản của mình.</w:t>
-      </w:r>
-    </w:p>
-    <w:p>
-      <w:pPr>
-        <w:pStyle w:val="ListBullet"/>
-        <w:spacing w:after="40"/>
-        <w:rPr>
-          <w:color w:val="000000" w:themeColor="text1"/>
-        </w:rPr>
-      </w:pPr>
-      <w:r>
-        <w:rPr>
-          <w:color w:val="000000" w:themeColor="text1"/>
-        </w:rPr>
-        <w:t>Hệ thống lưu nội dung và số sao mới sau khi cập nhật thành công.</w:t>
-      </w:r>
-    </w:p>
-    <w:p>
-      <w:pPr>
-        <w:pStyle w:val="ListBullet"/>
-        <w:spacing w:after="40"/>
-        <w:rPr>
-          <w:color w:val="000000" w:themeColor="text1"/>
-        </w:rPr>
-      </w:pPr>
-      <w:r>
-        <w:rPr>
-          <w:color w:val="000000" w:themeColor="text1"/>
-        </w:rPr>
-        <w:t>Nếu cập nhật thất bại, hệ thống thông báo lỗi và không ghi nhận dữ liệu chưa hợp lệ.</w:t>
-      </w:r>
-    </w:p>
-    <w:p>
-      <w:pPr>
-        <w:pStyle w:val="Heading2"/>
-        <w:rPr>
-          <w:color w:val="000000" w:themeColor="text1"/>
-        </w:rPr>
-      </w:pPr>
-      <w:r>
-        <w:rPr>
-          <w:color w:val="000000" w:themeColor="text1"/>
-        </w:rPr>
-        <w:t>3. Feature F2 và các User Story thuộc F2</w:t>
-      </w:r>
-    </w:p>
-    <w:p>
-      <w:pPr>
-        <w:rPr>
-          <w:color w:val="000000" w:themeColor="text1"/>
-        </w:rPr>
-      </w:pPr>
-      <w:r>
-        <w:rPr>
-          <w:color w:val="000000" w:themeColor="text1"/>
-        </w:rPr>
-        <w:t>Tên Feature: F2 – Xem đánh giá và xếp hạng sản phẩm</w:t>
-      </w:r>
-    </w:p>
-    <w:p>
-      <w:pPr>
-        <w:pStyle w:val="Heading3"/>
-        <w:rPr>
-          <w:color w:val="000000" w:themeColor="text1"/>
-        </w:rPr>
-      </w:pPr>
-      <w:r>
-        <w:rPr>
-          <w:color w:val="000000" w:themeColor="text1"/>
-        </w:rPr>
-        <w:t>S4 – Xem điểm đánh giá trung bình</w:t>
-      </w:r>
-    </w:p>
-    <w:p>
-      <w:pPr>
-        <w:rPr>
-          <w:color w:val="000000" w:themeColor="text1"/>
-        </w:rPr>
-      </w:pPr>
-      <w:r>
-        <w:rPr>
-          <w:color w:val="000000" w:themeColor="text1"/>
-        </w:rPr>
-        <w:t>As a khách hàng đang xem sản phẩm, I want xem điểm đánh giá trung bình theo thang điểm 1–5 sao, so that tôi có thể nhanh chóng đánh giá mức độ hài lòng chung của những người mua trước.</w:t>
-      </w:r>
-    </w:p>
-    <w:p>
-      <w:pPr>
-        <w:rPr>
-          <w:color w:val="000000" w:themeColor="text1"/>
-        </w:rPr>
-      </w:pPr>
-      <w:r>
-        <w:rPr>
-          <w:color w:val="000000" w:themeColor="text1"/>
-        </w:rPr>
-        <w:t>Tiêu chí chấp nhận:</w:t>
-      </w:r>
-    </w:p>
-    <w:p>
-      <w:pPr>
-        <w:pStyle w:val="ListBullet"/>
-        <w:spacing w:after="40"/>
-        <w:rPr>
-          <w:color w:val="000000" w:themeColor="text1"/>
-        </w:rPr>
-      </w:pPr>
-      <w:r>
-        <w:rPr>
-          <w:color w:val="000000" w:themeColor="text1"/>
-        </w:rPr>
-        <w:t>Hệ thống hiển thị điểm trung bình của các đánh giá hợp lệ đã được duyệt.</w:t>
-      </w:r>
-    </w:p>
-    <w:p>
-      <w:pPr>
-        <w:pStyle w:val="ListBullet"/>
-        <w:spacing w:after="40"/>
-        <w:rPr>
-          <w:color w:val="000000" w:themeColor="text1"/>
-        </w:rPr>
-      </w:pPr>
-      <w:r>
-        <w:rPr>
-          <w:color w:val="000000" w:themeColor="text1"/>
-        </w:rPr>
-        <w:t>Điểm trung bình được tính bằng tổng số sao chia cho tổng số đánh giá hợp lệ và làm tròn đến một chữ số thập phân.</w:t>
-      </w:r>
-    </w:p>
-    <w:p>
-      <w:pPr>
-        <w:pStyle w:val="ListBullet"/>
-        <w:spacing w:after="40"/>
-        <w:rPr>
-          <w:color w:val="000000" w:themeColor="text1"/>
-        </w:rPr>
-      </w:pPr>
-      <w:r>
-        <w:rPr>
-          <w:color w:val="000000" w:themeColor="text1"/>
-        </w:rPr>
-        <w:t>Nếu chưa có đánh giá hợp lệ, hệ thống hiển thị “Chưa có đánh giá”.</w:t>
-      </w:r>
-    </w:p>
-    <w:p>
-      <w:pPr>
-        <w:pStyle w:val="Heading3"/>
-        <w:rPr>
-          <w:color w:val="000000" w:themeColor="text1"/>
-        </w:rPr>
-      </w:pPr>
-      <w:r>
-        <w:rPr>
-          <w:color w:val="000000" w:themeColor="text1"/>
-        </w:rPr>
-        <w:t>S5 – Xem danh sách đánh giá</w:t>
-      </w:r>
-    </w:p>
-    <w:p>
-      <w:pPr>
-        <w:rPr>
-          <w:color w:val="000000" w:themeColor="text1"/>
-        </w:rPr>
-      </w:pPr>
-      <w:r>
-        <w:rPr>
-          <w:color w:val="000000" w:themeColor="text1"/>
-        </w:rPr>
-        <w:t>As a khách hàng đang xem sản phẩm, I want xem danh sách bình luận và số sao của những đánh giá đã được duyệt, so that tôi có thể tham khảo trải nghiệm thực tế của khách hàng khác trước khi mua.</w:t>
-      </w:r>
-    </w:p>
-    <w:p>
-      <w:pPr>
-        <w:rPr>
-          <w:color w:val="000000" w:themeColor="text1"/>
-        </w:rPr>
-      </w:pPr>
-      <w:r>
-        <w:rPr>
-          <w:color w:val="000000" w:themeColor="text1"/>
-        </w:rPr>
-        <w:t>Tiêu chí chấp nhận:</w:t>
-      </w:r>
-    </w:p>
-    <w:p>
-      <w:pPr>
-        <w:pStyle w:val="ListBullet"/>
-        <w:spacing w:after="40"/>
-        <w:rPr>
-          <w:color w:val="000000" w:themeColor="text1"/>
-        </w:rPr>
-      </w:pPr>
-      <w:r>
-        <w:rPr>
-          <w:color w:val="000000" w:themeColor="text1"/>
-        </w:rPr>
-        <w:t>Mỗi đánh giá hiển thị số sao, nội dung bình luận và thời điểm đăng.</w:t>
-      </w:r>
-    </w:p>
-    <w:p>
-      <w:pPr>
-        <w:pStyle w:val="ListBullet"/>
-        <w:spacing w:after="40"/>
-        <w:rPr>
-          <w:color w:val="000000" w:themeColor="text1"/>
-        </w:rPr>
-      </w:pPr>
-      <w:r>
-        <w:rPr>
-          <w:color w:val="000000" w:themeColor="text1"/>
-        </w:rPr>
-        <w:t>Chỉ hiển thị đánh giá đã được duyệt.</w:t>
-      </w:r>
-    </w:p>
-    <w:p>
-      <w:pPr>
-        <w:pStyle w:val="ListBullet"/>
-        <w:spacing w:after="40"/>
-        <w:rPr>
-          <w:color w:val="000000" w:themeColor="text1"/>
-        </w:rPr>
-      </w:pPr>
-      <w:r>
-        <w:rPr>
-          <w:color w:val="000000" w:themeColor="text1"/>
-        </w:rPr>
-        <w:t>Nếu chưa có đánh giá được duyệt, hệ thống hiển thị thông báo phù hợp.</w:t>
-      </w:r>
-    </w:p>
-    <w:p>
-      <w:pPr>
-        <w:pStyle w:val="Heading2"/>
-        <w:rPr>
-          <w:color w:val="000000" w:themeColor="text1"/>
-        </w:rPr>
-      </w:pPr>
-      <w:r>
-        <w:rPr>
-          <w:color w:val="000000" w:themeColor="text1"/>
-        </w:rPr>
-        <w:t>4. Tách S2 thành 3 User Story</w:t>
-      </w:r>
-    </w:p>
-    <w:p>
-      <w:pPr>
-        <w:pStyle w:val="Heading3"/>
-        <w:rPr>
-          <w:color w:val="000000" w:themeColor="text1"/>
-        </w:rPr>
-      </w:pPr>
-      <w:r>
-        <w:rPr>
-          <w:color w:val="000000" w:themeColor="text1"/>
-        </w:rPr>
-        <w:t>S2.1 – Viết bình luận đánh giá</w:t>
-      </w:r>
-    </w:p>
-    <w:p>
-      <w:pPr>
-        <w:rPr>
-          <w:color w:val="000000" w:themeColor="text1"/>
-        </w:rPr>
-      </w:pPr>
-      <w:r>
-        <w:rPr>
-          <w:color w:val="000000" w:themeColor="text1"/>
-        </w:rPr>
-        <w:t>As a khách hàng đã mua sản phẩm, I want viết bình luận đánh giá, so that tôi có thể chia sẻ trải nghiệm sử dụng sản phẩm.</w:t>
-      </w:r>
-    </w:p>
-    <w:p>
-      <w:pPr>
-        <w:rPr>
-          <w:color w:val="000000" w:themeColor="text1"/>
-        </w:rPr>
-      </w:pPr>
-      <w:r>
-        <w:rPr>
-          <w:color w:val="000000" w:themeColor="text1"/>
-        </w:rPr>
-        <w:t>Tiêu chí chấp nhận: Cho phép nhập nội dung bình luận; từ chối nội dung rỗng hoặc vượt giới hạn ký tự đã được quy định.</w:t>
-      </w:r>
-    </w:p>
-    <w:p>
-      <w:pPr>
-        <w:pStyle w:val="Heading3"/>
-        <w:rPr>
-          <w:color w:val="000000" w:themeColor="text1"/>
-        </w:rPr>
-      </w:pPr>
-      <w:r>
-        <w:rPr>
-          <w:color w:val="000000" w:themeColor="text1"/>
-        </w:rPr>
-        <w:t>S2.2 – Đính kèm ảnh vào đánh giá</w:t>
-      </w:r>
-    </w:p>
-    <w:p>
-      <w:pPr>
-        <w:rPr>
-          <w:color w:val="000000" w:themeColor="text1"/>
-        </w:rPr>
-      </w:pPr>
-      <w:r>
-        <w:rPr>
-          <w:color w:val="000000" w:themeColor="text1"/>
-        </w:rPr>
-        <w:t>As a khách hàng đã mua sản phẩm, I want đính kèm ảnh vào đánh giá, so that tôi có thể minh họa trải nghiệm thực tế của mình.</w:t>
-      </w:r>
-    </w:p>
-    <w:p>
-      <w:pPr>
-        <w:rPr>
-          <w:color w:val="000000" w:themeColor="text1"/>
-        </w:rPr>
-      </w:pPr>
-      <w:r>
-        <w:rPr>
-          <w:color w:val="000000" w:themeColor="text1"/>
-        </w:rPr>
-        <w:t>Tiêu chí chấp nhận: Chỉ chấp nhận định dạng ảnh được hỗ trợ; giới hạn số lượng và dung lượng ảnh phải được Product Owner thống nhất trước khi triển khai.</w:t>
-      </w:r>
-    </w:p>
-    <w:p>
-      <w:pPr>
-        <w:pStyle w:val="Heading3"/>
-        <w:rPr>
-          <w:color w:val="000000" w:themeColor="text1"/>
-        </w:rPr>
-      </w:pPr>
-      <w:r>
-        <w:rPr>
-          <w:color w:val="000000" w:themeColor="text1"/>
-        </w:rPr>
-        <w:lastRenderedPageBreak/>
-        <w:t>S2.3 – Gửi đánh giá để kiểm duyệt</w:t>
-      </w:r>
-    </w:p>
-    <w:p>
-      <w:pPr>
-        <w:rPr>
-          <w:color w:val="000000" w:themeColor="text1"/>
-        </w:rPr>
-      </w:pPr>
-      <w:r>
-        <w:rPr>
-          <w:color w:val="000000" w:themeColor="text1"/>
-        </w:rPr>
-        <w:t>As a khách hàng đã mua sản phẩm, I want gửi đánh giá gồm số sao và nội dung đã nhập, so that đánh giá của tôi được chuyển đến hệ thống để xem xét trước khi công khai.</w:t>
-      </w:r>
-    </w:p>
-    <w:p>
-      <w:pPr>
-        <w:rPr>
-          <w:color w:val="000000" w:themeColor="text1"/>
-        </w:rPr>
-      </w:pPr>
-      <w:r>
-        <w:rPr>
-          <w:color w:val="000000" w:themeColor="text1"/>
-        </w:rPr>
-        <w:t>Tiêu chí chấp nhận:</w:t>
-      </w:r>
-    </w:p>
-    <w:p>
-      <w:pPr>
-        <w:pStyle w:val="ListBullet"/>
-        <w:spacing w:after="40"/>
-        <w:rPr>
-          <w:color w:val="000000" w:themeColor="text1"/>
-        </w:rPr>
-      </w:pPr>
-      <w:r>
-        <w:rPr>
-          <w:color w:val="000000" w:themeColor="text1"/>
-        </w:rPr>
-        <w:t>Chỉ cho phép gửi khi dữ liệu bắt buộc hợp lệ.</w:t>
-      </w:r>
-    </w:p>
-    <w:p>
-      <w:pPr>
-        <w:pStyle w:val="ListBullet"/>
-        <w:spacing w:after="40"/>
-        <w:rPr>
-          <w:color w:val="000000" w:themeColor="text1"/>
-        </w:rPr>
-      </w:pPr>
-      <w:r>
-        <w:rPr>
-          <w:color w:val="000000" w:themeColor="text1"/>
-        </w:rPr>
-        <w:t>Sau khi gửi thành công, hệ thống lưu đánh giá với trạng thái “Chờ kiểm duyệt”.</w:t>
-      </w:r>
-    </w:p>
-    <w:p>
-      <w:pPr>
-        <w:pStyle w:val="ListBullet"/>
-        <w:spacing w:after="40"/>
-        <w:rPr>
-          <w:color w:val="000000" w:themeColor="text1"/>
-        </w:rPr>
-      </w:pPr>
-      <w:r>
-        <w:rPr>
-          <w:color w:val="000000" w:themeColor="text1"/>
-        </w:rPr>
-        <w:t>Đánh giá chưa được duyệt không xuất hiện công khai.</w:t>
-      </w:r>
-    </w:p>
-    <w:p>
-      <w:pPr>
-        <w:rPr>
-          <w:color w:val="000000" w:themeColor="text1"/>
-        </w:rPr>
-      </w:pPr>
-      <w:r>
-        <w:rPr>
-          <w:color w:val="000000" w:themeColor="text1"/>
-        </w:rPr>
-        <w:t>Lưu ý: Kiểm duyệt và hiển thị công khai có thể được tách thành User Story riêng nếu quy mô nghiệp vụ yêu cầu. Cần làm rõ kiểm duyệt tự động hay thủ công. Trong đề xuất này, S2.3 tập trung vào việc gửi đánh giá và lưu trạng thái chờ kiểm duyệt.</w:t>
-      </w:r>
-    </w:p>
-    <w:p>
-      <w:pPr>
-        <w:pStyle w:val="Heading2"/>
-        <w:rPr>
-          <w:color w:val="000000" w:themeColor="text1"/>
-        </w:rPr>
-      </w:pPr>
-      <w:r>
-        <w:rPr>
-          <w:color w:val="000000" w:themeColor="text1"/>
-        </w:rPr>
-        <w:t>5. Kết luận</w:t>
-      </w:r>
-    </w:p>
-    <w:p>
-      <w:pPr>
-        <w:pStyle w:val="ListBullet"/>
-        <w:spacing w:after="40"/>
-        <w:rPr>
-          <w:color w:val="000000" w:themeColor="text1"/>
-        </w:rPr>
-      </w:pPr>
-      <w:r>
-        <w:rPr>
-          <w:color w:val="000000" w:themeColor="text1"/>
-        </w:rPr>
-        <w:t>S1 hợp lệ; S2 sai cấp độ và gộp nhiều chức năng nên cần tách nhỏ.</w:t>
-      </w:r>
-    </w:p>
-    <w:p>
-      <w:pPr>
-        <w:pStyle w:val="ListBullet"/>
-        <w:spacing w:after="40"/>
-        <w:rPr>
-          <w:color w:val="000000" w:themeColor="text1"/>
-        </w:rPr>
-      </w:pPr>
-      <w:r>
-        <w:rPr>
-          <w:color w:val="000000" w:themeColor="text1"/>
-        </w:rPr>
-        <w:t>F2 được đặt tên là “Xem đánh giá và xếp hạng sản phẩm”; bổ sung S3, S4, S5 và tách S2 thành S2.1–S2.3.</w:t>
-      </w:r>
-    </w:p>
-    <w:p>
-      <w:pPr>
-        <w:pStyle w:val="ListBullet"/>
-        <w:spacing w:after="40"/>
-        <w:rPr>
-          <w:color w:val="000000" w:themeColor="text1"/>
-        </w:rPr>
-      </w:pPr>
-      <w:r>
-        <w:rPr>
-          <w:color w:val="000000" w:themeColor="text1"/>
-        </w:rPr>
-        <w:t>Mỗi User Story cần có giá trị nghiệp vụ rõ ràng, phạm vi đủ nhỏ, có thể ước lượng và có tiêu chí nghiệm thu cụ thể.</w:t>
-      </w:r>
-    </w:p>
-    <w:p>
-      <w:pPr>
-        <w:rPr>
-          <w:color w:val="000000" w:themeColor="text1"/>
-        </w:rPr>
-      </w:pPr>
-      <w:r>
-        <w:rPr>
-          <w:color w:val="000000" w:themeColor="text1"/>
-        </w:rPr>
-        <w:t>Backlog cần được Product Owner xác nhận các quy tắc như giới hạn ký tự, số lượng ảnh, dung lượng ảnh và quy trình kiểm duyệt trước Sprint Planning.</w:t>
-      </w:r>
-    </w:p>
+    <w:p/>
     <w:sectPr>
       <w:headerReference w:type="default" r:id="rId8"/>
       <w:footerReference w:type="default" r:id="rId9"/>
@@ -1217,7 +2018,7 @@
   <w:abstractNum w:abstractNumId="7" w15:restartNumberingAfterBreak="0">
     <w:nsid w:val="FFFFFF88"/>
     <w:multiLevelType w:val="singleLevel"/>
-    <w:tmpl w:val="D0A62B40"/>
+    <w:tmpl w:val="CDCA54F8"/>
     <w:lvl w:ilvl="0">
       <w:start w:val="1"/>
       <w:numFmt w:val="decimal"/>
@@ -1235,7 +2036,7 @@
   <w:abstractNum w:abstractNumId="8" w15:restartNumberingAfterBreak="0">
     <w:nsid w:val="FFFFFF89"/>
     <w:multiLevelType w:val="singleLevel"/>
-    <w:tmpl w:val="29761A62"/>
+    <w:tmpl w:val="73DE6C6C"/>
     <w:lvl w:ilvl="0">
       <w:start w:val="1"/>
       <w:numFmt w:val="bullet"/>
@@ -1279,6 +2080,9 @@
   </w:num>
   <w:num w:numId="9" w16cid:durableId="690305030">
     <w:abstractNumId w:val="0"/>
+  </w:num>
+  <w:num w:numId="10" w16cid:durableId="340207574">
+    <w:abstractNumId w:val="7"/>
   </w:num>
 </w:numbering>
 </file>
@@ -1892,7 +2696,6 @@
   <w:style w:type="character" w:default="1" w:styleId="DefaultParagraphFont">
     <w:name w:val="Default Paragraph Font"/>
     <w:uiPriority w:val="1"/>
-    <w:semiHidden/>
     <w:unhideWhenUsed/>
   </w:style>
   <w:style w:type="table" w:default="1" w:styleId="TableNormal">

</xml_diff>